<commit_message>
po213 v3: UST-02 v2.1 al publish
</commit_message>
<xml_diff>
--- a/publish/hub/documentation/ust/UST-2026-08-18-02-today-dashboard.docx
+++ b/publish/hub/documentation/ust/UST-2026-08-18-02-today-dashboard.docx
@@ -15,7 +15,7 @@
           <w:sz w:val="34"/>
           <w:szCs w:val="34"/>
         </w:rPr>
-        <w:t xml:space="preserve">UST-2026-08-18-02 · Today como dashboard de nutrición</w:t>
+        <w:t xml:space="preserve">UST-2026-08-18-02 · v2 — Today: P2 de Lucía + navegador temporal</w:t>
       </w:r>
     </w:p>
     <w:p>
@@ -29,7 +29,7 @@
           <w:sz w:val="19"/>
           <w:szCs w:val="19"/>
         </w:rPr>
-        <w:t xml:space="preserve">Release propuesta: 0.22.4 (OTA) · Epic P · Autor: asistente · Valida: Juanjo</w:t>
+        <w:t xml:space="preserve">Release propuesta: 0.22.5 (OTA) · Epic P · Autor: asistente · Decide layout: Juanjo (19-ago) sobre los Figma de Lucía</w:t>
       </w:r>
     </w:p>
     <w:p>
@@ -45,7 +45,7 @@
           <w:sz w:val="21"/>
           <w:szCs w:val="21"/>
         </w:rPr>
-        <w:t xml:space="preserve">ESTADO: PENDIENTE DE VALIDACIÓN — no se escribe código hasta el visto bueno fila a fila (regla UST, 18-ago).</w:t>
+        <w:t xml:space="preserve">ESTADO: EN CONSTRUCCIÓN (19-ago) — L1·L2·L3·L5 validadas · L4 se construye con la propuesta propia (revisión de Pilar/Lucía posterior, decisión Juanjo) · L6 con el puente phase_food ACTIVADO (el recetario de Constanza entra después como data).</w:t>
       </w:r>
     </w:p>
     <w:p>
@@ -75,7 +75,7 @@
           <w:sz w:val="21"/>
           <w:szCs w:val="21"/>
         </w:rPr>
-        <w:t xml:space="preserve">Como usuaria, quiero que la pestaña NutriLog me enseñe DE UN VISTAZO lo que ya he comido y bebido hoy — no una lista de tareas — y un único botón claro para registrar la siguiente comida, para entender mi día sin fricción.</w:t>
+        <w:t xml:space="preserve">Como usuaria, quiero que mi Today me cuente el día de un vistazo — mi fase, mi cuerpo, mis básicos, qué me sugiere mi fase y qué llevo comido — y poder viajar atrás (ayer con derecho a apuntar lo que olvidé; más atrás, solo mirar; meses y años, en resumen) con un único botón claro para registrar.</w:t>
       </w:r>
     </w:p>
     <w:p>
@@ -91,7 +91,7 @@
           <w:sz w:val="26"/>
           <w:szCs w:val="26"/>
         </w:rPr>
-        <w:t xml:space="preserve">Cambios, uno a uno</w:t>
+        <w:t xml:space="preserve">Decisiones, una a una</w:t>
       </w:r>
     </w:p>
     <w:tbl>
@@ -108,9 +108,9 @@
       </w:tblPr>
       <w:tblGrid>
         <w:gridCol w:w="700"/>
-        <w:gridCol w:w="2900"/>
-        <w:gridCol w:w="3100"/>
-        <w:gridCol w:w="3400"/>
+        <w:gridCol w:w="2600"/>
+        <w:gridCol w:w="3600"/>
+        <w:gridCol w:w="3200"/>
       </w:tblGrid>
       <w:tr>
         <w:tc>
@@ -140,7 +140,7 @@
         </w:tc>
         <w:tc>
           <w:tcPr>
-            <w:tcW w:type="dxa" w:w="2900"/>
+            <w:tcW w:type="dxa" w:w="2600"/>
             <w:shd w:fill="FFF1E6" w:val="clear"/>
             <w:tcMar>
               <w:top w:type="dxa" w:w="60"/>
@@ -159,13 +159,13 @@
                 <w:sz w:val="19"/>
                 <w:szCs w:val="19"/>
               </w:rPr>
-              <w:t xml:space="preserve">Requerimiento (Juanjo, 18-ago)</w:t>
-            </w:r>
-          </w:p>
-        </w:tc>
-        <w:tc>
-          <w:tcPr>
-            <w:tcW w:type="dxa" w:w="3100"/>
+              <w:t xml:space="preserve">Requerimiento</w:t>
+            </w:r>
+          </w:p>
+        </w:tc>
+        <w:tc>
+          <w:tcPr>
+            <w:tcW w:type="dxa" w:w="3600"/>
             <w:shd w:fill="FFF1E6" w:val="clear"/>
             <w:tcMar>
               <w:top w:type="dxa" w:w="60"/>
@@ -190,7 +190,7 @@
         </w:tc>
         <w:tc>
           <w:tcPr>
-            <w:tcW w:type="dxa" w:w="3400"/>
+            <w:tcW w:type="dxa" w:w="3200"/>
             <w:shd w:fill="FFF1E6" w:val="clear"/>
             <w:tcMar>
               <w:top w:type="dxa" w:w="60"/>
@@ -209,7 +209,7 @@
                 <w:sz w:val="19"/>
                 <w:szCs w:val="19"/>
               </w:rPr>
-              <w:t xml:space="preserve">Preguntas / decisiones a validar</w:t>
+              <w:t xml:space="preserve">Estado de validación</w:t>
             </w:r>
           </w:p>
         </w:tc>
@@ -235,79 +235,80 @@
                 <w:sz w:val="19"/>
                 <w:szCs w:val="19"/>
               </w:rPr>
-              <w:t xml:space="preserve">T1</w:t>
-            </w:r>
-          </w:p>
-        </w:tc>
-        <w:tc>
-          <w:tcPr>
-            <w:tcW w:type="dxa" w:w="2900"/>
-            <w:tcMar>
-              <w:top w:type="dxa" w:w="60"/>
-              <w:left w:type="dxa" w:w="80"/>
-              <w:bottom w:type="dxa" w:w="60"/>
-              <w:right w:type="dxa" w:w="80"/>
-            </w:tcMar>
-          </w:tcPr>
-          <w:p>
-            <w:r>
-              <w:rPr>
-                <w:rFonts w:ascii="Calibri" w:cs="Calibri" w:eastAsia="Calibri" w:hAnsi="Calibri"/>
-                <w:b w:val="false"/>
-                <w:bCs w:val="false"/>
-                <w:color w:val="3D1E25"/>
-                <w:sz w:val="19"/>
-                <w:szCs w:val="19"/>
-              </w:rPr>
-              <w:t xml:space="preserve">Quitar del Today la lista «Check off what you eat today» (checklist de componentes con Most Recommended).</w:t>
-            </w:r>
-          </w:p>
-        </w:tc>
-        <w:tc>
-          <w:tcPr>
-            <w:tcW w:type="dxa" w:w="3100"/>
-            <w:tcMar>
-              <w:top w:type="dxa" w:w="60"/>
-              <w:left w:type="dxa" w:w="80"/>
-              <w:bottom w:type="dxa" w:w="60"/>
-              <w:right w:type="dxa" w:w="80"/>
-            </w:tcMar>
-          </w:tcPr>
-          <w:p>
-            <w:r>
-              <w:rPr>
-                <w:rFonts w:ascii="Calibri" w:cs="Calibri" w:eastAsia="Calibri" w:hAnsi="Calibri"/>
-                <w:b w:val="false"/>
-                <w:bCs w:val="false"/>
-                <w:color w:val="3D1E25"/>
-                <w:sz w:val="19"/>
-                <w:szCs w:val="19"/>
-              </w:rPr>
-              <w:t xml:space="preserve">La sección desaparece del Today. El Today deja de ser lista de trabajo y pasa a ser dashboard.</w:t>
-            </w:r>
-          </w:p>
-        </w:tc>
-        <w:tc>
-          <w:tcPr>
-            <w:tcW w:type="dxa" w:w="3400"/>
-            <w:tcMar>
-              <w:top w:type="dxa" w:w="60"/>
-              <w:left w:type="dxa" w:w="80"/>
-              <w:bottom w:type="dxa" w:w="60"/>
-              <w:right w:type="dxa" w:w="80"/>
-            </w:tcMar>
-          </w:tcPr>
-          <w:p>
-            <w:r>
-              <w:rPr>
-                <w:rFonts w:ascii="Calibri" w:cs="Calibri" w:eastAsia="Calibri" w:hAnsi="Calibri"/>
-                <w:b w:val="false"/>
-                <w:bCs w:val="false"/>
-                <w:color w:val="3D1E25"/>
-                <w:sz w:val="19"/>
-                <w:szCs w:val="19"/>
-              </w:rPr>
-              <w:t xml:space="preserve">DECISIÓN: la lista es el motor de recomendaciones por fase (scoring de Constanza). Propuesta: no se borra del producto — vive dentro del flujo «Add Manually» como sugerencias de la fase. ¿SÍ a moverla ahí, o fuera del todo?</w:t>
+              <w:t xml:space="preserve">L1</w:t>
+            </w:r>
+          </w:p>
+        </w:tc>
+        <w:tc>
+          <w:tcPr>
+            <w:tcW w:type="dxa" w:w="2600"/>
+            <w:tcMar>
+              <w:top w:type="dxa" w:w="60"/>
+              <w:left w:type="dxa" w:w="80"/>
+              <w:bottom w:type="dxa" w:w="60"/>
+              <w:right w:type="dxa" w:w="80"/>
+            </w:tcMar>
+          </w:tcPr>
+          <w:p>
+            <w:r>
+              <w:rPr>
+                <w:rFonts w:ascii="Calibri" w:cs="Calibri" w:eastAsia="Calibri" w:hAnsi="Calibri"/>
+                <w:b w:val="false"/>
+                <w:bCs w:val="false"/>
+                <w:color w:val="3D1E25"/>
+                <w:sz w:val="19"/>
+                <w:szCs w:val="19"/>
+              </w:rPr>
+              <w:t xml:space="preserve">Layout del Today = P2 «Add Meal Method» de Lucía, completado.</w:t>
+            </w:r>
+          </w:p>
+        </w:tc>
+        <w:tc>
+          <w:tcPr>
+            <w:tcW w:type="dxa" w:w="3600"/>
+            <w:tcMar>
+              <w:top w:type="dxa" w:w="60"/>
+              <w:left w:type="dxa" w:w="80"/>
+              <w:bottom w:type="dxa" w:w="60"/>
+              <w:right w:type="dxa" w:w="80"/>
+            </w:tcMar>
+          </w:tcPr>
+          <w:p>
+            <w:r>
+              <w:rPr>
+                <w:rFonts w:ascii="Calibri" w:cs="Calibri" w:eastAsia="Calibri" w:hAnsi="Calibri"/>
+                <w:b w:val="false"/>
+                <w:bCs w:val="false"/>
+                <w:color w:val="3D1E25"/>
+                <w:sz w:val="19"/>
+                <w:szCs w:val="19"/>
+              </w:rPr>
+              <w:t xml:space="preserve">Orden final: navegador ‹ Today › → tarjeta Daily Tip (fase+día) → tarjeta Body Insight COMPLETA (texto + Nutri + Mood/Energy/Flow dentro) → Nutri Basics (FUEL + VITALITY) → 3 recetas sugeridas de la fase → Today’s Meals (registradas) → CTA único largo naranja «📷 + Log Your Meal». Checklist fuera (T1: vive en Add Manually como sugerencias). Pestañas fuera.</w:t>
+            </w:r>
+          </w:p>
+        </w:tc>
+        <w:tc>
+          <w:tcPr>
+            <w:tcW w:type="dxa" w:w="3200"/>
+            <w:shd w:fill="E8F5EE" w:val="clear"/>
+            <w:tcMar>
+              <w:top w:type="dxa" w:w="60"/>
+              <w:left w:type="dxa" w:w="80"/>
+              <w:bottom w:type="dxa" w:w="60"/>
+              <w:right w:type="dxa" w:w="80"/>
+            </w:tcMar>
+          </w:tcPr>
+          <w:p>
+            <w:r>
+              <w:rPr>
+                <w:rFonts w:ascii="Calibri" w:cs="Calibri" w:eastAsia="Calibri" w:hAnsi="Calibri"/>
+                <w:b w:val="false"/>
+                <w:bCs w:val="false"/>
+                <w:color w:val="3D1E25"/>
+                <w:sz w:val="19"/>
+                <w:szCs w:val="19"/>
+              </w:rPr>
+              <w:t xml:space="preserve">✅ VALIDADA (Juanjo, 19-ago, sobre los Figma de Lucía con sus prototipos)</w:t>
             </w:r>
           </w:p>
         </w:tc>
@@ -333,79 +334,80 @@
                 <w:sz w:val="19"/>
                 <w:szCs w:val="19"/>
               </w:rPr>
-              <w:t xml:space="preserve">T2</w:t>
-            </w:r>
-          </w:p>
-        </w:tc>
-        <w:tc>
-          <w:tcPr>
-            <w:tcW w:type="dxa" w:w="2900"/>
-            <w:tcMar>
-              <w:top w:type="dxa" w:w="60"/>
-              <w:left w:type="dxa" w:w="80"/>
-              <w:bottom w:type="dxa" w:w="60"/>
-              <w:right w:type="dxa" w:w="80"/>
-            </w:tcMar>
-          </w:tcPr>
-          <w:p>
-            <w:r>
-              <w:rPr>
-                <w:rFonts w:ascii="Calibri" w:cs="Calibri" w:eastAsia="Calibri" w:hAnsi="Calibri"/>
-                <w:b w:val="false"/>
-                <w:bCs w:val="false"/>
-                <w:color w:val="3D1E25"/>
-                <w:sz w:val="19"/>
-                <w:szCs w:val="19"/>
-              </w:rPr>
-              <w:t xml:space="preserve">Today = dashboard de nutrición: información AGREGADA de lo comido y bebido hoy.</w:t>
-            </w:r>
-          </w:p>
-        </w:tc>
-        <w:tc>
-          <w:tcPr>
-            <w:tcW w:type="dxa" w:w="3100"/>
-            <w:tcMar>
-              <w:top w:type="dxa" w:w="60"/>
-              <w:left w:type="dxa" w:w="80"/>
-              <w:bottom w:type="dxa" w:w="60"/>
-              <w:right w:type="dxa" w:w="80"/>
-            </w:tcMar>
-          </w:tcPr>
-          <w:p>
-            <w:r>
-              <w:rPr>
-                <w:rFonts w:ascii="Calibri" w:cs="Calibri" w:eastAsia="Calibri" w:hAnsi="Calibri"/>
-                <w:b w:val="false"/>
-                <w:bCs w:val="false"/>
-                <w:color w:val="3D1E25"/>
-                <w:sz w:val="19"/>
-                <w:szCs w:val="19"/>
-              </w:rPr>
-              <w:t xml:space="preserve">Nueva sección «Today’s meals»: las comidas confirmadas HOY (día LOCAL, regla NS-0010) con hora, tipo (desayuno/comida/cena/snack/bebida), nº de alimentos y tier de alineación si lo hay. FUEL pasa a contar comidas reales (n/3). Tarjetas Daily Tip, FUEL y VITALITY se conservan.</w:t>
-            </w:r>
-          </w:p>
-        </w:tc>
-        <w:tc>
-          <w:tcPr>
-            <w:tcW w:type="dxa" w:w="3400"/>
-            <w:tcMar>
-              <w:top w:type="dxa" w:w="60"/>
-              <w:left w:type="dxa" w:w="80"/>
-              <w:bottom w:type="dxa" w:w="60"/>
-              <w:right w:type="dxa" w:w="80"/>
-            </w:tcMar>
-          </w:tcPr>
-          <w:p>
-            <w:r>
-              <w:rPr>
-                <w:rFonts w:ascii="Calibri" w:cs="Calibri" w:eastAsia="Calibri" w:hAnsi="Calibri"/>
-                <w:b w:val="false"/>
-                <w:bCs w:val="false"/>
-                <w:color w:val="3D1E25"/>
-                <w:sz w:val="19"/>
-                <w:szCs w:val="19"/>
-              </w:rPr>
-              <w:t xml:space="preserve">«Bebido»: hoy no hay contador de agua — las bebidas registradas (tipo drink) SÍ salen en el agregado. ¿Vale así en esta OTA, y el contador de hidratación real queda como item aparte?</w:t>
+              <w:t xml:space="preserve">L2</w:t>
+            </w:r>
+          </w:p>
+        </w:tc>
+        <w:tc>
+          <w:tcPr>
+            <w:tcW w:type="dxa" w:w="2600"/>
+            <w:tcMar>
+              <w:top w:type="dxa" w:w="60"/>
+              <w:left w:type="dxa" w:w="80"/>
+              <w:bottom w:type="dxa" w:w="60"/>
+              <w:right w:type="dxa" w:w="80"/>
+            </w:tcMar>
+          </w:tcPr>
+          <w:p>
+            <w:r>
+              <w:rPr>
+                <w:rFonts w:ascii="Calibri" w:cs="Calibri" w:eastAsia="Calibri" w:hAnsi="Calibri"/>
+                <w:b w:val="false"/>
+                <w:bCs w:val="false"/>
+                <w:color w:val="3D1E25"/>
+                <w:sz w:val="19"/>
+                <w:szCs w:val="19"/>
+              </w:rPr>
+              <w:t xml:space="preserve">Fotos pequeñas REALES, no iconos.</w:t>
+            </w:r>
+          </w:p>
+        </w:tc>
+        <w:tc>
+          <w:tcPr>
+            <w:tcW w:type="dxa" w:w="3600"/>
+            <w:tcMar>
+              <w:top w:type="dxa" w:w="60"/>
+              <w:left w:type="dxa" w:w="80"/>
+              <w:bottom w:type="dxa" w:w="60"/>
+              <w:right w:type="dxa" w:w="80"/>
+            </w:tcMar>
+          </w:tcPr>
+          <w:p>
+            <w:r>
+              <w:rPr>
+                <w:rFonts w:ascii="Calibri" w:cs="Calibri" w:eastAsia="Calibri" w:hAnsi="Calibri"/>
+                <w:b w:val="false"/>
+                <w:bCs w:val="false"/>
+                <w:color w:val="3D1E25"/>
+                <w:sz w:val="19"/>
+                <w:szCs w:val="19"/>
+              </w:rPr>
+              <w:t xml:space="preserve">Recetas sugeridas: foto propia por receta (asset estático). Comidas registradas: miniatura de la foto de la usuaria (URL firmada del bucket privado meal-images, corta caducidad); comida manual sin foto → placeholder neutro. Nota: en MEAL HISTORY se mantiene lo validado en UST-03: solo texto (matiz de Pilar) — las fotos viven en el Today.</w:t>
+            </w:r>
+          </w:p>
+        </w:tc>
+        <w:tc>
+          <w:tcPr>
+            <w:tcW w:type="dxa" w:w="3200"/>
+            <w:shd w:fill="E8F5EE" w:val="clear"/>
+            <w:tcMar>
+              <w:top w:type="dxa" w:w="60"/>
+              <w:left w:type="dxa" w:w="80"/>
+              <w:bottom w:type="dxa" w:w="60"/>
+              <w:right w:type="dxa" w:w="80"/>
+            </w:tcMar>
+          </w:tcPr>
+          <w:p>
+            <w:r>
+              <w:rPr>
+                <w:rFonts w:ascii="Calibri" w:cs="Calibri" w:eastAsia="Calibri" w:hAnsi="Calibri"/>
+                <w:b w:val="false"/>
+                <w:bCs w:val="false"/>
+                <w:color w:val="3D1E25"/>
+                <w:sz w:val="19"/>
+                <w:szCs w:val="19"/>
+              </w:rPr>
+              <w:t xml:space="preserve">✅ VALIDADA (Juanjo) · dependencia: fotos de las recetas = Lucía</w:t>
             </w:r>
           </w:p>
         </w:tc>
@@ -431,79 +433,80 @@
                 <w:sz w:val="19"/>
                 <w:szCs w:val="19"/>
               </w:rPr>
-              <w:t xml:space="preserve">T3</w:t>
-            </w:r>
-          </w:p>
-        </w:tc>
-        <w:tc>
-          <w:tcPr>
-            <w:tcW w:type="dxa" w:w="2900"/>
-            <w:tcMar>
-              <w:top w:type="dxa" w:w="60"/>
-              <w:left w:type="dxa" w:w="80"/>
-              <w:bottom w:type="dxa" w:w="60"/>
-              <w:right w:type="dxa" w:w="80"/>
-            </w:tcMar>
-          </w:tcPr>
-          <w:p>
-            <w:r>
-              <w:rPr>
-                <w:rFonts w:ascii="Calibri" w:cs="Calibri" w:eastAsia="Calibri" w:hAnsi="Calibri"/>
-                <w:b w:val="false"/>
-                <w:bCs w:val="false"/>
-                <w:color w:val="3D1E25"/>
-                <w:sz w:val="19"/>
-                <w:szCs w:val="19"/>
-              </w:rPr>
-              <w:t xml:space="preserve">UN solo botón para registrar (no dos): «+ Log Today’s Meal» con el icono de cámara DENTRO.</w:t>
-            </w:r>
-          </w:p>
-        </w:tc>
-        <w:tc>
-          <w:tcPr>
-            <w:tcW w:type="dxa" w:w="3100"/>
-            <w:tcMar>
-              <w:top w:type="dxa" w:w="60"/>
-              <w:left w:type="dxa" w:w="80"/>
-              <w:bottom w:type="dxa" w:w="60"/>
-              <w:right w:type="dxa" w:w="80"/>
-            </w:tcMar>
-          </w:tcPr>
-          <w:p>
-            <w:r>
-              <w:rPr>
-                <w:rFonts w:ascii="Calibri" w:cs="Calibri" w:eastAsia="Calibri" w:hAnsi="Calibri"/>
-                <w:b w:val="false"/>
-                <w:bCs w:val="false"/>
-                <w:color w:val="3D1E25"/>
-                <w:sz w:val="19"/>
-                <w:szCs w:val="19"/>
-              </w:rPr>
-              <w:t xml:space="preserve">Se retira el botón flotante de cámara. Queda un único CTA «📷 + Log Today’s Meal» → abre la pantalla de método (Scan / Add Manually / galería), que ya es el selector natural.</w:t>
-            </w:r>
-          </w:p>
-        </w:tc>
-        <w:tc>
-          <w:tcPr>
-            <w:tcW w:type="dxa" w:w="3400"/>
-            <w:tcMar>
-              <w:top w:type="dxa" w:w="60"/>
-              <w:left w:type="dxa" w:w="80"/>
-              <w:bottom w:type="dxa" w:w="60"/>
-              <w:right w:type="dxa" w:w="80"/>
-            </w:tcMar>
-          </w:tcPr>
-          <w:p>
-            <w:r>
-              <w:rPr>
-                <w:rFonts w:ascii="Calibri" w:cs="Calibri" w:eastAsia="Calibri" w:hAnsi="Calibri"/>
-                <w:b w:val="false"/>
-                <w:bCs w:val="false"/>
-                <w:color w:val="3D1E25"/>
-                <w:sz w:val="19"/>
-                <w:szCs w:val="19"/>
-              </w:rPr>
-              <w:t xml:space="preserve">¿El CTA va directo al método (propuesta) o directo a la cámara con el método accesible atrás?</w:t>
+              <w:t xml:space="preserve">L3</w:t>
+            </w:r>
+          </w:p>
+        </w:tc>
+        <w:tc>
+          <w:tcPr>
+            <w:tcW w:type="dxa" w:w="2600"/>
+            <w:tcMar>
+              <w:top w:type="dxa" w:w="60"/>
+              <w:left w:type="dxa" w:w="80"/>
+              <w:bottom w:type="dxa" w:w="60"/>
+              <w:right w:type="dxa" w:w="80"/>
+            </w:tcMar>
+          </w:tcPr>
+          <w:p>
+            <w:r>
+              <w:rPr>
+                <w:rFonts w:ascii="Calibri" w:cs="Calibri" w:eastAsia="Calibri" w:hAnsi="Calibri"/>
+                <w:b w:val="false"/>
+                <w:bCs w:val="false"/>
+                <w:color w:val="3D1E25"/>
+                <w:sz w:val="19"/>
+                <w:szCs w:val="19"/>
+              </w:rPr>
+              <w:t xml:space="preserve">Navegador temporal ‹ Today ›.</w:t>
+            </w:r>
+          </w:p>
+        </w:tc>
+        <w:tc>
+          <w:tcPr>
+            <w:tcW w:type="dxa" w:w="3600"/>
+            <w:tcMar>
+              <w:top w:type="dxa" w:w="60"/>
+              <w:left w:type="dxa" w:w="80"/>
+              <w:bottom w:type="dxa" w:w="60"/>
+              <w:right w:type="dxa" w:w="80"/>
+            </w:tcMar>
+          </w:tcPr>
+          <w:p>
+            <w:r>
+              <w:rPr>
+                <w:rFonts w:ascii="Calibri" w:cs="Calibri" w:eastAsia="Calibri" w:hAnsi="Calibri"/>
+                <w:b w:val="false"/>
+                <w:bCs w:val="false"/>
+                <w:color w:val="3D1E25"/>
+                <w:sz w:val="19"/>
+                <w:szCs w:val="19"/>
+              </w:rPr>
+              <w:t xml:space="preserve">Pill central con flechas. Hacia atrás: 7 días día a día → granularidad mensual → trimestral → anual. Tope: fecha de alta de la usuaria. Futuro: bloqueado (flecha › inerte en Today). En días pasados el título muestra el día («Tue, Aug 12»).</w:t>
+            </w:r>
+          </w:p>
+        </w:tc>
+        <w:tc>
+          <w:tcPr>
+            <w:tcW w:type="dxa" w:w="3200"/>
+            <w:shd w:fill="E8F5EE" w:val="clear"/>
+            <w:tcMar>
+              <w:top w:type="dxa" w:w="60"/>
+              <w:left w:type="dxa" w:w="80"/>
+              <w:bottom w:type="dxa" w:w="60"/>
+              <w:right w:type="dxa" w:w="80"/>
+            </w:tcMar>
+          </w:tcPr>
+          <w:p>
+            <w:r>
+              <w:rPr>
+                <w:rFonts w:ascii="Calibri" w:cs="Calibri" w:eastAsia="Calibri" w:hAnsi="Calibri"/>
+                <w:b w:val="false"/>
+                <w:bCs w:val="false"/>
+                <w:color w:val="3D1E25"/>
+                <w:sz w:val="19"/>
+                <w:szCs w:val="19"/>
+              </w:rPr>
+              <w:t xml:space="preserve">✅ VALIDADA (Juanjo: Q3 sí · Q4 sí)</w:t>
             </w:r>
           </w:p>
         </w:tc>
@@ -529,79 +532,80 @@
                 <w:sz w:val="19"/>
                 <w:szCs w:val="19"/>
               </w:rPr>
-              <w:t xml:space="preserve">T4</w:t>
-            </w:r>
-          </w:p>
-        </w:tc>
-        <w:tc>
-          <w:tcPr>
-            <w:tcW w:type="dxa" w:w="2900"/>
-            <w:tcMar>
-              <w:top w:type="dxa" w:w="60"/>
-              <w:left w:type="dxa" w:w="80"/>
-              <w:bottom w:type="dxa" w:w="60"/>
-              <w:right w:type="dxa" w:w="80"/>
-            </w:tcMar>
-          </w:tcPr>
-          <w:p>
-            <w:r>
-              <w:rPr>
-                <w:rFonts w:ascii="Calibri" w:cs="Calibri" w:eastAsia="Calibri" w:hAnsi="Calibri"/>
-                <w:b w:val="false"/>
-                <w:bCs w:val="false"/>
-                <w:color w:val="3D1E25"/>
-                <w:sz w:val="19"/>
-                <w:szCs w:val="19"/>
-              </w:rPr>
-              <w:t xml:space="preserve">La pestaña «Body Insight» debería decir «Body Insights» (plural).</w:t>
-            </w:r>
-          </w:p>
-        </w:tc>
-        <w:tc>
-          <w:tcPr>
-            <w:tcW w:type="dxa" w:w="3100"/>
-            <w:tcMar>
-              <w:top w:type="dxa" w:w="60"/>
-              <w:left w:type="dxa" w:w="80"/>
-              <w:bottom w:type="dxa" w:w="60"/>
-              <w:right w:type="dxa" w:w="80"/>
-            </w:tcMar>
-          </w:tcPr>
-          <w:p>
-            <w:r>
-              <w:rPr>
-                <w:rFonts w:ascii="Calibri" w:cs="Calibri" w:eastAsia="Calibri" w:hAnsi="Calibri"/>
-                <w:b w:val="false"/>
-                <w:bCs w:val="false"/>
-                <w:color w:val="3D1E25"/>
-                <w:sz w:val="19"/>
-                <w:szCs w:val="19"/>
-              </w:rPr>
-              <w:t xml:space="preserve">Renombrar en los 14 catálogos (es clave i18n).</w:t>
-            </w:r>
-          </w:p>
-        </w:tc>
-        <w:tc>
-          <w:tcPr>
-            <w:tcW w:type="dxa" w:w="3400"/>
-            <w:tcMar>
-              <w:top w:type="dxa" w:w="60"/>
-              <w:left w:type="dxa" w:w="80"/>
-              <w:bottom w:type="dxa" w:w="60"/>
-              <w:right w:type="dxa" w:w="80"/>
-            </w:tcMar>
-          </w:tcPr>
-          <w:p>
-            <w:r>
-              <w:rPr>
-                <w:rFonts w:ascii="Calibri" w:cs="Calibri" w:eastAsia="Calibri" w:hAnsi="Calibri"/>
-                <w:b w:val="false"/>
-                <w:bCs w:val="false"/>
-                <w:color w:val="3D1E25"/>
-                <w:sz w:val="19"/>
-                <w:szCs w:val="19"/>
-              </w:rPr>
-              <w:t xml:space="preserve">Confirmar que en ES sigue como esté hoy o se ajusta también (p. ej. «Tu cuerpo hoy»). ¿Solo EN o revisamos el ES?</w:t>
+              <w:t xml:space="preserve">L4</w:t>
+            </w:r>
+          </w:p>
+        </w:tc>
+        <w:tc>
+          <w:tcPr>
+            <w:tcW w:type="dxa" w:w="2600"/>
+            <w:tcMar>
+              <w:top w:type="dxa" w:w="60"/>
+              <w:left w:type="dxa" w:w="80"/>
+              <w:bottom w:type="dxa" w:w="60"/>
+              <w:right w:type="dxa" w:w="80"/>
+            </w:tcMar>
+          </w:tcPr>
+          <w:p>
+            <w:r>
+              <w:rPr>
+                <w:rFonts w:ascii="Calibri" w:cs="Calibri" w:eastAsia="Calibri" w:hAnsi="Calibri"/>
+                <w:b w:val="false"/>
+                <w:bCs w:val="false"/>
+                <w:color w:val="3D1E25"/>
+                <w:sz w:val="19"/>
+                <w:szCs w:val="19"/>
+              </w:rPr>
+              <w:t xml:space="preserve">Qué enseñan los AGREGADOS (mes · trimestre · año).</w:t>
+            </w:r>
+          </w:p>
+        </w:tc>
+        <w:tc>
+          <w:tcPr>
+            <w:tcW w:type="dxa" w:w="3600"/>
+            <w:tcMar>
+              <w:top w:type="dxa" w:w="60"/>
+              <w:left w:type="dxa" w:w="80"/>
+              <w:bottom w:type="dxa" w:w="60"/>
+              <w:right w:type="dxa" w:w="80"/>
+            </w:tcMar>
+          </w:tcPr>
+          <w:p>
+            <w:r>
+              <w:rPr>
+                <w:rFonts w:ascii="Calibri" w:cs="Calibri" w:eastAsia="Calibri" w:hAnsi="Calibri"/>
+                <w:b w:val="false"/>
+                <w:bCs w:val="false"/>
+                <w:color w:val="3D1E25"/>
+                <w:sz w:val="19"/>
+                <w:szCs w:val="19"/>
+              </w:rPr>
+              <w:t xml:space="preserve">CAS medio del periodo · comidas registradas · distribución de tiers de alineación · mood y energía medios. El Daily Tip, el Body Insight diario, las recetas y el CTA se OCULTAN en vistas agregadas (no aplican a un periodo). RPC de agregados nueva, servida por rangos que fija la app (día local, NS-0010).</w:t>
+            </w:r>
+          </w:p>
+        </w:tc>
+        <w:tc>
+          <w:tcPr>
+            <w:tcW w:type="dxa" w:w="3200"/>
+            <w:shd w:fill="E8F5EE" w:val="clear"/>
+            <w:tcMar>
+              <w:top w:type="dxa" w:w="60"/>
+              <w:left w:type="dxa" w:w="80"/>
+              <w:bottom w:type="dxa" w:w="60"/>
+              <w:right w:type="dxa" w:w="80"/>
+            </w:tcMar>
+          </w:tcPr>
+          <w:p>
+            <w:r>
+              <w:rPr>
+                <w:rFonts w:ascii="Calibri" w:cs="Calibri" w:eastAsia="Calibri" w:hAnsi="Calibri"/>
+                <w:b w:val="false"/>
+                <w:bCs w:val="false"/>
+                <w:color w:val="3D1E25"/>
+                <w:sz w:val="19"/>
+                <w:szCs w:val="19"/>
+              </w:rPr>
+              <w:t xml:space="preserve">✅ CONSTRUIR YA (Juanjo 19-ago) · revisión Pilar+Lucía posterior</w:t>
             </w:r>
           </w:p>
         </w:tc>
@@ -627,79 +631,80 @@
                 <w:sz w:val="19"/>
                 <w:szCs w:val="19"/>
               </w:rPr>
-              <w:t xml:space="preserve">T5</w:t>
-            </w:r>
-          </w:p>
-        </w:tc>
-        <w:tc>
-          <w:tcPr>
-            <w:tcW w:type="dxa" w:w="2900"/>
-            <w:tcMar>
-              <w:top w:type="dxa" w:w="60"/>
-              <w:left w:type="dxa" w:w="80"/>
-              <w:bottom w:type="dxa" w:w="60"/>
-              <w:right w:type="dxa" w:w="80"/>
-            </w:tcMar>
-          </w:tcPr>
-          <w:p>
-            <w:r>
-              <w:rPr>
-                <w:rFonts w:ascii="Calibri" w:cs="Calibri" w:eastAsia="Calibri" w:hAnsi="Calibri"/>
-                <w:b w:val="false"/>
-                <w:bCs w:val="false"/>
-                <w:color w:val="3D1E25"/>
-                <w:sz w:val="19"/>
-                <w:szCs w:val="19"/>
-              </w:rPr>
-              <w:t xml:space="preserve">«Lo mismo para la tab de Body Insights» — alcance a confirmar.</w:t>
-            </w:r>
-          </w:p>
-        </w:tc>
-        <w:tc>
-          <w:tcPr>
-            <w:tcW w:type="dxa" w:w="3100"/>
-            <w:tcMar>
-              <w:top w:type="dxa" w:w="60"/>
-              <w:left w:type="dxa" w:w="80"/>
-              <w:bottom w:type="dxa" w:w="60"/>
-              <w:right w:type="dxa" w:w="80"/>
-            </w:tcMar>
-          </w:tcPr>
-          <w:p>
-            <w:r>
-              <w:rPr>
-                <w:rFonts w:ascii="Calibri" w:cs="Calibri" w:eastAsia="Calibri" w:hAnsi="Calibri"/>
-                <w:b w:val="false"/>
-                <w:bCs w:val="false"/>
-                <w:color w:val="3D1E25"/>
-                <w:sz w:val="19"/>
-                <w:szCs w:val="19"/>
-              </w:rPr>
-              <w:t xml:space="preserve">Interpretación mínima: renombrar (T4) y conservar su contenido actual. Si «lo mismo» = también agregado/limpieza de esa tab, especificar qué sobra y qué falta.</w:t>
-            </w:r>
-          </w:p>
-        </w:tc>
-        <w:tc>
-          <w:tcPr>
-            <w:tcW w:type="dxa" w:w="3400"/>
-            <w:tcMar>
-              <w:top w:type="dxa" w:w="60"/>
-              <w:left w:type="dxa" w:w="80"/>
-              <w:bottom w:type="dxa" w:w="60"/>
-              <w:right w:type="dxa" w:w="80"/>
-            </w:tcMar>
-          </w:tcPr>
-          <w:p>
-            <w:r>
-              <w:rPr>
-                <w:rFonts w:ascii="Calibri" w:cs="Calibri" w:eastAsia="Calibri" w:hAnsi="Calibri"/>
-                <w:b w:val="false"/>
-                <w:bCs w:val="false"/>
-                <w:color w:val="3D1E25"/>
-                <w:sz w:val="19"/>
-                <w:szCs w:val="19"/>
-              </w:rPr>
-              <w:t xml:space="preserve">¿Qué cambia exactamente dentro de Body Insights además del nombre?</w:t>
+              <w:t xml:space="preserve">L5</w:t>
+            </w:r>
+          </w:p>
+        </w:tc>
+        <w:tc>
+          <w:tcPr>
+            <w:tcW w:type="dxa" w:w="2600"/>
+            <w:tcMar>
+              <w:top w:type="dxa" w:w="60"/>
+              <w:left w:type="dxa" w:w="80"/>
+              <w:bottom w:type="dxa" w:w="60"/>
+              <w:right w:type="dxa" w:w="80"/>
+            </w:tcMar>
+          </w:tcPr>
+          <w:p>
+            <w:r>
+              <w:rPr>
+                <w:rFonts w:ascii="Calibri" w:cs="Calibri" w:eastAsia="Calibri" w:hAnsi="Calibri"/>
+                <w:b w:val="false"/>
+                <w:bCs w:val="false"/>
+                <w:color w:val="3D1E25"/>
+                <w:sz w:val="19"/>
+                <w:szCs w:val="19"/>
+              </w:rPr>
+              <w:t xml:space="preserve">Registro retroactivo: SOLO AYER.</w:t>
+            </w:r>
+          </w:p>
+        </w:tc>
+        <w:tc>
+          <w:tcPr>
+            <w:tcW w:type="dxa" w:w="3600"/>
+            <w:tcMar>
+              <w:top w:type="dxa" w:w="60"/>
+              <w:left w:type="dxa" w:w="80"/>
+              <w:bottom w:type="dxa" w:w="60"/>
+              <w:right w:type="dxa" w:w="80"/>
+            </w:tcMar>
+          </w:tcPr>
+          <w:p>
+            <w:r>
+              <w:rPr>
+                <w:rFonts w:ascii="Calibri" w:cs="Calibri" w:eastAsia="Calibri" w:hAnsi="Calibri"/>
+                <w:b w:val="false"/>
+                <w:bCs w:val="false"/>
+                <w:color w:val="3D1E25"/>
+                <w:sz w:val="19"/>
+                <w:szCs w:val="19"/>
+              </w:rPr>
+              <w:t xml:space="preserve">El CTA de log aparece en Today y en AYER (registra con fecha de ayer; el CAS de ayer se recalcula). De anteayer hacia atrás: solo lectura, sin CTA. Guardia en cliente y en servidor (la fecha aceptada por la RPC/insert se limita a hoy-1).</w:t>
+            </w:r>
+          </w:p>
+        </w:tc>
+        <w:tc>
+          <w:tcPr>
+            <w:tcW w:type="dxa" w:w="3200"/>
+            <w:shd w:fill="E8F5EE" w:val="clear"/>
+            <w:tcMar>
+              <w:top w:type="dxa" w:w="60"/>
+              <w:left w:type="dxa" w:w="80"/>
+              <w:bottom w:type="dxa" w:w="60"/>
+              <w:right w:type="dxa" w:w="80"/>
+            </w:tcMar>
+          </w:tcPr>
+          <w:p>
+            <w:r>
+              <w:rPr>
+                <w:rFonts w:ascii="Calibri" w:cs="Calibri" w:eastAsia="Calibri" w:hAnsi="Calibri"/>
+                <w:b w:val="false"/>
+                <w:bCs w:val="false"/>
+                <w:color w:val="3D1E25"/>
+                <w:sz w:val="19"/>
+                <w:szCs w:val="19"/>
+              </w:rPr>
+              <w:t xml:space="preserve">✅ VALIDADA (Juanjo: «solo ayer, no más allá»)</w:t>
             </w:r>
           </w:p>
         </w:tc>
@@ -725,13 +730,211 @@
                 <w:sz w:val="19"/>
                 <w:szCs w:val="19"/>
               </w:rPr>
+              <w:t xml:space="preserve">L6</w:t>
+            </w:r>
+          </w:p>
+        </w:tc>
+        <w:tc>
+          <w:tcPr>
+            <w:tcW w:type="dxa" w:w="2600"/>
+            <w:tcMar>
+              <w:top w:type="dxa" w:w="60"/>
+              <w:left w:type="dxa" w:w="80"/>
+              <w:bottom w:type="dxa" w:w="60"/>
+              <w:right w:type="dxa" w:w="80"/>
+            </w:tcMar>
+          </w:tcPr>
+          <w:p>
+            <w:r>
+              <w:rPr>
+                <w:rFonts w:ascii="Calibri" w:cs="Calibri" w:eastAsia="Calibri" w:hAnsi="Calibri"/>
+                <w:b w:val="false"/>
+                <w:bCs w:val="false"/>
+                <w:color w:val="3D1E25"/>
+                <w:sz w:val="19"/>
+                <w:szCs w:val="19"/>
+              </w:rPr>
+              <w:t xml:space="preserve">Contenido de las 3 recetas por fase (el corazón editorial de P2).</w:t>
+            </w:r>
+          </w:p>
+        </w:tc>
+        <w:tc>
+          <w:tcPr>
+            <w:tcW w:type="dxa" w:w="3600"/>
+            <w:tcMar>
+              <w:top w:type="dxa" w:w="60"/>
+              <w:left w:type="dxa" w:w="80"/>
+              <w:bottom w:type="dxa" w:w="60"/>
+              <w:right w:type="dxa" w:w="80"/>
+            </w:tcMar>
+          </w:tcPr>
+          <w:p>
+            <w:r>
+              <w:rPr>
+                <w:rFonts w:ascii="Calibri" w:cs="Calibri" w:eastAsia="Calibri" w:hAnsi="Calibri"/>
+                <w:b w:val="false"/>
+                <w:bCs w:val="false"/>
+                <w:color w:val="3D1E25"/>
+                <w:sz w:val="19"/>
+                <w:szCs w:val="19"/>
+              </w:rPr>
+              <w:t xml:space="preserve">Cada fase necesita sus recetas (nombre, foto, línea de beneficio, tags, chip SYNC). PUENTE propuesto para no bloquear: v1 lanza leyendo el catálogo phase_food YA existente y aprobado (julio) mientras Constanza cura el recetario definitivo; se sustituye por contenido nuevo sin OTA (es data).</w:t>
+            </w:r>
+          </w:p>
+        </w:tc>
+        <w:tc>
+          <w:tcPr>
+            <w:tcW w:type="dxa" w:w="3200"/>
+            <w:shd w:fill="E8F5EE" w:val="clear"/>
+            <w:tcMar>
+              <w:top w:type="dxa" w:w="60"/>
+              <w:left w:type="dxa" w:w="80"/>
+              <w:bottom w:type="dxa" w:w="60"/>
+              <w:right w:type="dxa" w:w="80"/>
+            </w:tcMar>
+          </w:tcPr>
+          <w:p>
+            <w:r>
+              <w:rPr>
+                <w:rFonts w:ascii="Calibri" w:cs="Calibri" w:eastAsia="Calibri" w:hAnsi="Calibri"/>
+                <w:b w:val="false"/>
+                <w:bCs w:val="false"/>
+                <w:color w:val="3D1E25"/>
+                <w:sz w:val="19"/>
+                <w:szCs w:val="19"/>
+              </w:rPr>
+              <w:t xml:space="preserve">✅ PUENTE phase_food ACTIVADO (Juanjo 19-ago) · el recetario Constanza/Lucía/Pilar entra como data</w:t>
+            </w:r>
+          </w:p>
+        </w:tc>
+      </w:tr>
+      <w:tr>
+        <w:tc>
+          <w:tcPr>
+            <w:tcW w:type="dxa" w:w="700"/>
+            <w:tcMar>
+              <w:top w:type="dxa" w:w="60"/>
+              <w:left w:type="dxa" w:w="80"/>
+              <w:bottom w:type="dxa" w:w="60"/>
+              <w:right w:type="dxa" w:w="80"/>
+            </w:tcMar>
+          </w:tcPr>
+          <w:p>
+            <w:r>
+              <w:rPr>
+                <w:rFonts w:ascii="Calibri" w:cs="Calibri" w:eastAsia="Calibri" w:hAnsi="Calibri"/>
+                <w:b/>
+                <w:bCs/>
+                <w:color w:val="3D1E25"/>
+                <w:sz w:val="19"/>
+                <w:szCs w:val="19"/>
+              </w:rPr>
+              <w:t xml:space="preserve">L7</w:t>
+            </w:r>
+          </w:p>
+        </w:tc>
+        <w:tc>
+          <w:tcPr>
+            <w:tcW w:type="dxa" w:w="2600"/>
+            <w:tcMar>
+              <w:top w:type="dxa" w:w="60"/>
+              <w:left w:type="dxa" w:w="80"/>
+              <w:bottom w:type="dxa" w:w="60"/>
+              <w:right w:type="dxa" w:w="80"/>
+            </w:tcMar>
+          </w:tcPr>
+          <w:p>
+            <w:r>
+              <w:rPr>
+                <w:rFonts w:ascii="Calibri" w:cs="Calibri" w:eastAsia="Calibri" w:hAnsi="Calibri"/>
+                <w:b w:val="false"/>
+                <w:bCs w:val="false"/>
+                <w:color w:val="3D1E25"/>
+                <w:sz w:val="19"/>
+                <w:szCs w:val="19"/>
+              </w:rPr>
+              <w:t xml:space="preserve">Herencias ya validadas de la v1 de esta UST.</w:t>
+            </w:r>
+          </w:p>
+        </w:tc>
+        <w:tc>
+          <w:tcPr>
+            <w:tcW w:type="dxa" w:w="3600"/>
+            <w:tcMar>
+              <w:top w:type="dxa" w:w="60"/>
+              <w:left w:type="dxa" w:w="80"/>
+              <w:bottom w:type="dxa" w:w="60"/>
+              <w:right w:type="dxa" w:w="80"/>
+            </w:tcMar>
+          </w:tcPr>
+          <w:p>
+            <w:r>
+              <w:rPr>
+                <w:rFonts w:ascii="Calibri" w:cs="Calibri" w:eastAsia="Calibri" w:hAnsi="Calibri"/>
+                <w:b w:val="false"/>
+                <w:bCs w:val="false"/>
+                <w:color w:val="3D1E25"/>
+                <w:sz w:val="19"/>
+                <w:szCs w:val="19"/>
+              </w:rPr>
+              <w:t xml:space="preserve">T1: el motor de recomendaciones se muda dentro de «Add Manually» como sugerencias de fase. T4: «Body Insights» en EN y el ES alineado en el mismo cambio.</w:t>
+            </w:r>
+          </w:p>
+        </w:tc>
+        <w:tc>
+          <w:tcPr>
+            <w:tcW w:type="dxa" w:w="3200"/>
+            <w:shd w:fill="E8F5EE" w:val="clear"/>
+            <w:tcMar>
+              <w:top w:type="dxa" w:w="60"/>
+              <w:left w:type="dxa" w:w="80"/>
+              <w:bottom w:type="dxa" w:w="60"/>
+              <w:right w:type="dxa" w:w="80"/>
+            </w:tcMar>
+          </w:tcPr>
+          <w:p>
+            <w:r>
+              <w:rPr>
+                <w:rFonts w:ascii="Calibri" w:cs="Calibri" w:eastAsia="Calibri" w:hAnsi="Calibri"/>
+                <w:b w:val="false"/>
+                <w:bCs w:val="false"/>
+                <w:color w:val="3D1E25"/>
+                <w:sz w:val="19"/>
+                <w:szCs w:val="19"/>
+              </w:rPr>
+              <w:t xml:space="preserve">✅ VALIDADAS (18-ago)</w:t>
+            </w:r>
+          </w:p>
+        </w:tc>
+      </w:tr>
+      <w:tr>
+        <w:tc>
+          <w:tcPr>
+            <w:tcW w:type="dxa" w:w="700"/>
+            <w:tcMar>
+              <w:top w:type="dxa" w:w="60"/>
+              <w:left w:type="dxa" w:w="80"/>
+              <w:bottom w:type="dxa" w:w="60"/>
+              <w:right w:type="dxa" w:w="80"/>
+            </w:tcMar>
+          </w:tcPr>
+          <w:p>
+            <w:r>
+              <w:rPr>
+                <w:rFonts w:ascii="Calibri" w:cs="Calibri" w:eastAsia="Calibri" w:hAnsi="Calibri"/>
+                <w:b/>
+                <w:bCs/>
+                <w:color w:val="3D1E25"/>
+                <w:sz w:val="19"/>
+                <w:szCs w:val="19"/>
+              </w:rPr>
               <w:t xml:space="preserve">G1</w:t>
             </w:r>
           </w:p>
         </w:tc>
         <w:tc>
           <w:tcPr>
-            <w:tcW w:type="dxa" w:w="2900"/>
+            <w:tcW w:type="dxa" w:w="2600"/>
             <w:tcMar>
               <w:top w:type="dxa" w:w="60"/>
               <w:left w:type="dxa" w:w="80"/>
@@ -755,49 +958,49 @@
         </w:tc>
         <w:tc>
           <w:tcPr>
-            <w:tcW w:type="dxa" w:w="3100"/>
-            <w:tcMar>
-              <w:top w:type="dxa" w:w="60"/>
-              <w:left w:type="dxa" w:w="80"/>
-              <w:bottom w:type="dxa" w:w="60"/>
-              <w:right w:type="dxa" w:w="80"/>
-            </w:tcMar>
-          </w:tcPr>
-          <w:p>
-            <w:r>
-              <w:rPr>
-                <w:rFonts w:ascii="Calibri" w:cs="Calibri" w:eastAsia="Calibri" w:hAnsi="Calibri"/>
-                <w:b w:val="false"/>
-                <w:bCs w:val="false"/>
-                <w:color w:val="3D1E25"/>
-                <w:sz w:val="19"/>
-                <w:szCs w:val="19"/>
-              </w:rPr>
-              <w:t xml:space="preserve">OTA 0.22.4 (JS puro). i18n ×14 para toda string nueva. tsc 0 · jest verde. Lógica de registro intacta.</w:t>
-            </w:r>
-          </w:p>
-        </w:tc>
-        <w:tc>
-          <w:tcPr>
-            <w:tcW w:type="dxa" w:w="3400"/>
-            <w:tcMar>
-              <w:top w:type="dxa" w:w="60"/>
-              <w:left w:type="dxa" w:w="80"/>
-              <w:bottom w:type="dxa" w:w="60"/>
-              <w:right w:type="dxa" w:w="80"/>
-            </w:tcMar>
-          </w:tcPr>
-          <w:p>
-            <w:r>
-              <w:rPr>
-                <w:rFonts w:ascii="Calibri" w:cs="Calibri" w:eastAsia="Calibri" w:hAnsi="Calibri"/>
-                <w:b w:val="false"/>
-                <w:bCs w:val="false"/>
-                <w:color w:val="3D1E25"/>
-                <w:sz w:val="19"/>
-                <w:szCs w:val="19"/>
-              </w:rPr>
-              <w:t xml:space="preserve">DoD: agregado visible con 2 comidas reales del día en TU móvil + cotejo de esta UST contra notas de release y contra lo desplegado.</w:t>
+            <w:tcW w:type="dxa" w:w="3600"/>
+            <w:tcMar>
+              <w:top w:type="dxa" w:w="60"/>
+              <w:left w:type="dxa" w:w="80"/>
+              <w:bottom w:type="dxa" w:w="60"/>
+              <w:right w:type="dxa" w:w="80"/>
+            </w:tcMar>
+          </w:tcPr>
+          <w:p>
+            <w:r>
+              <w:rPr>
+                <w:rFonts w:ascii="Calibri" w:cs="Calibri" w:eastAsia="Calibri" w:hAnsi="Calibri"/>
+                <w:b w:val="false"/>
+                <w:bCs w:val="false"/>
+                <w:color w:val="3D1E25"/>
+                <w:sz w:val="19"/>
+                <w:szCs w:val="19"/>
+              </w:rPr>
+              <w:t xml:space="preserve">Release 0.22.5 (OTA; sin piezas nativas). SQL: RPC de agregados + guardia de fecha retroactiva. i18n ×14 para toda string nueva. tsc 0 · jest verde (navegador y agregados con lógica pura testeada). DoD: paseo en dispositivo — Today nuevo, viaje a ayer con log, viaje a un mes con agregados — y cotejo triple UST↔release↔desplegado.</w:t>
+            </w:r>
+          </w:p>
+        </w:tc>
+        <w:tc>
+          <w:tcPr>
+            <w:tcW w:type="dxa" w:w="3200"/>
+            <w:tcMar>
+              <w:top w:type="dxa" w:w="60"/>
+              <w:left w:type="dxa" w:w="80"/>
+              <w:bottom w:type="dxa" w:w="60"/>
+              <w:right w:type="dxa" w:w="80"/>
+            </w:tcMar>
+          </w:tcPr>
+          <w:p>
+            <w:r>
+              <w:rPr>
+                <w:rFonts w:ascii="Calibri" w:cs="Calibri" w:eastAsia="Calibri" w:hAnsi="Calibri"/>
+                <w:b w:val="false"/>
+                <w:bCs w:val="false"/>
+                <w:color w:val="3D1E25"/>
+                <w:sz w:val="19"/>
+                <w:szCs w:val="19"/>
+              </w:rPr>
+              <w:t xml:space="preserve">⏳ Se cierra al construir</w:t>
             </w:r>
           </w:p>
         </w:tc>
@@ -817,7 +1020,7 @@
           <w:sz w:val="26"/>
           <w:szCs w:val="26"/>
         </w:rPr>
-        <w:t xml:space="preserve">Fuera de alcance (se dice ahora, no después)</w:t>
+        <w:t xml:space="preserve">Para Pilar y Lucía (lo que falta de vosotras)</w:t>
       </w:r>
     </w:p>
     <w:p>
@@ -835,7 +1038,7 @@
           <w:sz w:val="21"/>
           <w:szCs w:val="21"/>
         </w:rPr>
-        <w:t xml:space="preserve">Macros/calorías en el agregado: llegan con P2 (canonical_foods) — el agregado nace con comidas, tipos, alimentos y tiers.</w:t>
+        <w:t xml:space="preserve">L4 · Confirmar qué enseña un mes/trimestre/año (la propuesta de la tabla) y su tono.</w:t>
       </w:r>
     </w:p>
     <w:p>
@@ -853,7 +1056,7 @@
           <w:sz w:val="21"/>
           <w:szCs w:val="21"/>
         </w:rPr>
-        <w:t xml:space="preserve">Contador real de hidratación (si T2 lo confirma como item aparte).</w:t>
+        <w:t xml:space="preserve">L6 · Recetario por fase: Constanza el contenido, Lucía las fotos, Pilar el tono. Mientras: ¿vale el puente con phase_food?</w:t>
       </w:r>
     </w:p>
     <w:p>
@@ -871,7 +1074,7 @@
           <w:sz w:val="21"/>
           <w:szCs w:val="21"/>
         </w:rPr>
-        <w:t xml:space="preserve">Cámara custom con marco (sigue siendo nativa, 0.23).</w:t>
+        <w:t xml:space="preserve">Pendientes previos que siguen abiertos: 9 estados de error (Lucía) y 14 textos (Pilar) en copy-review.</w:t>
       </w:r>
     </w:p>
     <w:p>
@@ -902,7 +1105,7 @@
           <w:sz w:val="19"/>
           <w:szCs w:val="19"/>
         </w:rPr>
-        <w:t xml:space="preserve">Hub: /hub/documentation/ust/UST-2026-08-18-02-today-dashboard.docx · El item del 📚 backlog la enlazará al crearse (cuando esta UST quede validada).</w:t>
+        <w:t xml:space="preserve">Hub: /hub/documentation/ust/UST-2026-08-18-02-today-dashboard.docx (v2 sustituye a v1; la v1 queda en git). Figma fuente: NutriSync-MVP-Wireframe nodos 982-4751 y 971-4889. Prototipos P1/P2 v2: chat de ingeniería 19-ago.</w:t>
       </w:r>
     </w:p>
     <w:sectPr>

</xml_diff>

<commit_message>
r21: exportar Sprint Planning a Word y Excel sin vendors (HTML nativo, po74) junto al CSV
</commit_message>
<xml_diff>
--- a/publish/hub/documentation/ust/UST-2026-08-18-02-today-dashboard.docx
+++ b/publish/hub/documentation/ust/UST-2026-08-18-02-today-dashboard.docx
@@ -45,7 +45,7 @@
           <w:sz w:val="21"/>
           <w:szCs w:val="21"/>
         </w:rPr>
-        <w:t xml:space="preserve">ESTADO: EN CONSTRUCCIÓN (19-ago) — L1·L2·L3·L5 validadas · L4 se construye con la propuesta propia (revisión de Pilar/Lucía posterior, decisión Juanjo) · L6 con el puente phase_food ACTIVADO (el recetario de Constanza entra después como data).</w:t>
+        <w:t xml:space="preserve">ESTADO: VALIDADA POR JUANJO EN L1·L2·L3·L5 — quedan L4 (confirmación Pilar+Lucía) y L6 (contenido de recetas). Lo no confirmado no se construye… salvo el esqueleto validado.</w:t>
       </w:r>
     </w:p>
     <w:p>
@@ -587,25 +587,24 @@
         <w:tc>
           <w:tcPr>
             <w:tcW w:type="dxa" w:w="3200"/>
-            <w:shd w:fill="E8F5EE" w:val="clear"/>
-            <w:tcMar>
-              <w:top w:type="dxa" w:w="60"/>
-              <w:left w:type="dxa" w:w="80"/>
-              <w:bottom w:type="dxa" w:w="60"/>
-              <w:right w:type="dxa" w:w="80"/>
-            </w:tcMar>
-          </w:tcPr>
-          <w:p>
-            <w:r>
-              <w:rPr>
-                <w:rFonts w:ascii="Calibri" w:cs="Calibri" w:eastAsia="Calibri" w:hAnsi="Calibri"/>
-                <w:b w:val="false"/>
-                <w:bCs w:val="false"/>
-                <w:color w:val="3D1E25"/>
-                <w:sz w:val="19"/>
-                <w:szCs w:val="19"/>
-              </w:rPr>
-              <w:t xml:space="preserve">✅ CONSTRUIR YA (Juanjo 19-ago) · revisión Pilar+Lucía posterior</w:t>
+            <w:tcMar>
+              <w:top w:type="dxa" w:w="60"/>
+              <w:left w:type="dxa" w:w="80"/>
+              <w:bottom w:type="dxa" w:w="60"/>
+              <w:right w:type="dxa" w:w="80"/>
+            </w:tcMar>
+          </w:tcPr>
+          <w:p>
+            <w:r>
+              <w:rPr>
+                <w:rFonts w:ascii="Calibri" w:cs="Calibri" w:eastAsia="Calibri" w:hAnsi="Calibri"/>
+                <w:b w:val="false"/>
+                <w:bCs w:val="false"/>
+                <w:color w:val="3D1E25"/>
+                <w:sz w:val="19"/>
+                <w:szCs w:val="19"/>
+              </w:rPr>
+              <w:t xml:space="preserve">🟡 ACEPTADA por Juanjo — CONFIRMAN Pilar y Lucía (tono y presentación)</w:t>
             </w:r>
           </w:p>
         </w:tc>
@@ -785,25 +784,24 @@
         <w:tc>
           <w:tcPr>
             <w:tcW w:type="dxa" w:w="3200"/>
-            <w:shd w:fill="E8F5EE" w:val="clear"/>
-            <w:tcMar>
-              <w:top w:type="dxa" w:w="60"/>
-              <w:left w:type="dxa" w:w="80"/>
-              <w:bottom w:type="dxa" w:w="60"/>
-              <w:right w:type="dxa" w:w="80"/>
-            </w:tcMar>
-          </w:tcPr>
-          <w:p>
-            <w:r>
-              <w:rPr>
-                <w:rFonts w:ascii="Calibri" w:cs="Calibri" w:eastAsia="Calibri" w:hAnsi="Calibri"/>
-                <w:b w:val="false"/>
-                <w:bCs w:val="false"/>
-                <w:color w:val="3D1E25"/>
-                <w:sz w:val="19"/>
-                <w:szCs w:val="19"/>
-              </w:rPr>
-              <w:t xml:space="preserve">✅ PUENTE phase_food ACTIVADO (Juanjo 19-ago) · el recetario Constanza/Lucía/Pilar entra como data</w:t>
+            <w:tcMar>
+              <w:top w:type="dxa" w:w="60"/>
+              <w:left w:type="dxa" w:w="80"/>
+              <w:bottom w:type="dxa" w:w="60"/>
+              <w:right w:type="dxa" w:w="80"/>
+            </w:tcMar>
+          </w:tcPr>
+          <w:p>
+            <w:r>
+              <w:rPr>
+                <w:rFonts w:ascii="Calibri" w:cs="Calibri" w:eastAsia="Calibri" w:hAnsi="Calibri"/>
+                <w:b w:val="false"/>
+                <w:bCs w:val="false"/>
+                <w:color w:val="3D1E25"/>
+                <w:sz w:val="19"/>
+                <w:szCs w:val="19"/>
+              </w:rPr>
+              <w:t xml:space="preserve">🟡 PENDIENTE: Constanza (nutrición) · Lucía (foto/estilo) · Pilar (tono). El puente phase_food lo valida Juanjo</w:t>
             </w:r>
           </w:p>
         </w:tc>

</xml_diff>